<commit_message>
recovery-time table: not-estimable Cox fits, raw estimates as supplementary file; Locust version record
Two Cox cells (Hotel Reservation, hybrid_criticality, service level, kill and latency) had
CI upper bounds above 1e6 and now read 'not estimable', with a footnote. All raw values are
in paper/tables/tbl_trec_supplementary.csv and paper/submission/Supplementary_recovery_time_raw.csv.
data/environment/tool_versions.txt records the Locust version so numbers.csv rebuilds here
without SOURCE NOT FOUND. No files moved or removed.

Co-Authored-By: Claude Opus 5.5 <noreply@anthropic.com>
</commit_message>
<xml_diff>
--- a/paper/submission/Table 9.docx
+++ b/paper/submission/Table 9.docx
@@ -1155,7 +1155,7 @@
                 <w:b w:val="0"/>
                 <w:sz w:val="18"/>
               </w:rPr>
-              <w:t>0.124</w:t>
+              <w:t>not estimable</w:t>
             </w:r>
           </w:p>
         </w:tc>
@@ -1173,7 +1173,7 @@
                 <w:b w:val="0"/>
                 <w:sz w:val="18"/>
               </w:rPr>
-              <w:t>4.39e-19 to 3.50e+16</w:t>
+              <w:t>not estimable</w:t>
             </w:r>
           </w:p>
         </w:tc>
@@ -1191,7 +1191,7 @@
                 <w:b w:val="0"/>
                 <w:sz w:val="18"/>
               </w:rPr>
-              <w:t>0.9189</w:t>
+              <w:t>not estimable</w:t>
             </w:r>
           </w:p>
         </w:tc>
@@ -2099,7 +2099,7 @@
                 <w:b w:val="0"/>
                 <w:sz w:val="18"/>
               </w:rPr>
-              <w:t>1.02e-05</w:t>
+              <w:t>not estimable</w:t>
             </w:r>
           </w:p>
         </w:tc>
@@ -2117,7 +2117,7 @@
                 <w:b w:val="0"/>
                 <w:sz w:val="18"/>
               </w:rPr>
-              <w:t>4.03e-23 to 2.57e+12</w:t>
+              <w:t>not estimable</w:t>
             </w:r>
           </w:p>
         </w:tc>
@@ -2135,7 +2135,7 @@
                 <w:b w:val="0"/>
                 <w:sz w:val="18"/>
               </w:rPr>
-              <w:t>0.5740</w:t>
+              <w:t>not estimable</w:t>
             </w:r>
           </w:p>
         </w:tc>
@@ -2162,6 +2162,11 @@
     <w:p>
       <w:r>
         <w:t>Units are given in parentheses in the column headers; columns without a unit are dimensionless or categorical.</w:t>
+      </w:r>
+    </w:p>
+    <w:p>
+      <w:r>
+        <w:t>Not estimable: the Cox fit did not converge or showed separation because the predictor takes few distinct values; raw estimates are in the supplementary file.</w:t>
       </w:r>
     </w:p>
     <w:sectPr>

</xml_diff>